<commit_message>
Mark git versioning as partial and sync docs
</commit_message>
<xml_diff>
--- a/Pozadavky_PGRF3_2025_Task1.docx
+++ b/Pozadavky_PGRF3_2025_Task1.docx
@@ -3608,7 +3608,7 @@
           </w:tcPr>
           <w:p>
             <w:r>
-              <w:t>0</w:t>
+              <w:t>0.5</w:t>
             </w:r>
           </w:p>
         </w:tc>
@@ -3619,7 +3619,7 @@
           </w:tcPr>
           <w:p>
             <w:r>
-              <w:t>-</w:t>
+              <w:t>lokální repo a více commitů, remote/private repo není ověřeno</w:t>
             </w:r>
           </w:p>
         </w:tc>
@@ -3706,7 +3706,7 @@
           </w:tcPr>
           <w:p>
             <w:r>
-              <w:t>0</w:t>
+              <w:t>0.5</w:t>
             </w:r>
           </w:p>
         </w:tc>
@@ -3717,7 +3717,7 @@
           </w:tcPr>
           <w:p>
             <w:r>
-              <w:t>-</w:t>
+              <w:t>historie existuje, ale zatím je krátká</w:t>
             </w:r>
           </w:p>
         </w:tc>

</xml_diff>

<commit_message>
Add deferred shading and ambient occlusion pass
</commit_message>
<xml_diff>
--- a/Pozadavky_PGRF3_2025_Task1.docx
+++ b/Pozadavky_PGRF3_2025_Task1.docx
@@ -3194,7 +3194,7 @@
           </w:tcPr>
           <w:p>
             <w:r>
-              <w:t>0</w:t>
+              <w:t>1</w:t>
             </w:r>
           </w:p>
         </w:tc>
@@ -3206,7 +3206,7 @@
           </w:tcPr>
           <w:p>
             <w:r>
-              <w:t>-</w:t>
+              <w:t>G-buffer z pozice, normály a albeda</w:t>
             </w:r>
           </w:p>
         </w:tc>
@@ -3281,7 +3281,7 @@
           </w:tcPr>
           <w:p>
             <w:r>
-              <w:t>0</w:t>
+              <w:t>1</w:t>
             </w:r>
           </w:p>
         </w:tc>
@@ -3292,7 +3292,7 @@
           </w:tcPr>
           <w:p>
             <w:r>
-              <w:t>-</w:t>
+              <w:t>screen-space ambient occlusion z view-space pozic</w:t>
             </w:r>
           </w:p>
         </w:tc>
@@ -3403,7 +3403,7 @@
           </w:tcPr>
           <w:p>
             <w:r>
-              <w:t>0</w:t>
+              <w:t>1</w:t>
             </w:r>
           </w:p>
         </w:tc>
@@ -3414,7 +3414,7 @@
           </w:tcPr>
           <w:p>
             <w:r>
-              <w:t>-</w:t>
+              <w:t>box blur AO textury</w:t>
             </w:r>
           </w:p>
         </w:tc>
@@ -3489,7 +3489,7 @@
           </w:tcPr>
           <w:p>
             <w:r>
-              <w:t>0</w:t>
+              <w:t>1</w:t>
             </w:r>
           </w:p>
         </w:tc>
@@ -3500,7 +3500,7 @@
           </w:tcPr>
           <w:p>
             <w:r>
-              <w:t>-</w:t>
+              <w:t>finální composite s osvětlením a AO</w:t>
             </w:r>
           </w:p>
         </w:tc>

</xml_diff>